<commit_message>
doc edited (hypothesis added)
</commit_message>
<xml_diff>
--- a/reports/billing/Billing_doc.docx
+++ b/reports/billing/Billing_doc.docx
@@ -41,30 +41,14 @@
           <w:b/>
           <w:bCs/>
         </w:rPr>
-        <w:t xml:space="preserve">identify customers who are likely to churn before their renewal </w:t>
-      </w:r>
-      <w:proofErr w:type="gramStart"/>
-      <w:r>
-        <w:rPr>
-          <w:b/>
-          <w:bCs/>
-        </w:rPr>
-        <w:t>date</w:t>
-      </w:r>
-      <w:r>
-        <w:rPr>
-          <w:b/>
-          <w:bCs/>
-        </w:rPr>
-        <w:t>(</w:t>
-      </w:r>
-      <w:proofErr w:type="gramEnd"/>
-      <w:r>
-        <w:rPr>
-          <w:b/>
-          <w:bCs/>
-        </w:rPr>
-        <w:t>6 months to 45 days)</w:t>
+        <w:t>identify customers who are likely to churn before their renewal date</w:t>
+      </w:r>
+      <w:r>
+        <w:rPr>
+          <w:b/>
+          <w:bCs/>
+        </w:rPr>
+        <w:t>(6 months to 45 days)</w:t>
       </w:r>
       <w:r>
         <w:t>, using</w:t>
@@ -2072,6 +2056,209 @@
     <w:p>
       <w:pPr>
         <w:rPr>
+          <w:lang w:val="en-US"/>
+        </w:rPr>
+      </w:pPr>
+      <w:r>
+        <w:rPr>
+          <w:b/>
+          <w:bCs/>
+          <w:lang w:val="en-US"/>
+        </w:rPr>
+        <w:t> H5: Longer tenure in days (</w:t>
+      </w:r>
+      <w:proofErr w:type="spellStart"/>
+      <w:r>
+        <w:rPr>
+          <w:b/>
+          <w:bCs/>
+          <w:lang w:val="en-US"/>
+        </w:rPr>
+        <w:t>tenure_days</w:t>
+      </w:r>
+      <w:proofErr w:type="spellEnd"/>
+      <w:r>
+        <w:rPr>
+          <w:b/>
+          <w:bCs/>
+          <w:lang w:val="en-US"/>
+        </w:rPr>
+        <w:t>) is associated with lower churn</w:t>
+      </w:r>
+    </w:p>
+    <w:p>
+      <w:pPr>
+        <w:rPr>
+          <w:rFonts w:ascii="Consolas" w:hAnsi="Consolas"/>
+          <w:color w:val="BBBEBF"/>
+          <w:sz w:val="21"/>
+          <w:szCs w:val="21"/>
+        </w:rPr>
+      </w:pPr>
+      <w:r>
+        <w:t>Confirmed</w:t>
+      </w:r>
+      <w:r>
+        <w:rPr>
+          <w:rFonts w:ascii="Consolas" w:hAnsi="Consolas"/>
+          <w:color w:val="BBBEBF"/>
+          <w:sz w:val="21"/>
+          <w:szCs w:val="21"/>
+        </w:rPr>
+        <w:t xml:space="preserve"> </w:t>
+      </w:r>
+    </w:p>
+    <w:p>
+      <w:r>
+        <w:t xml:space="preserve">There is a significant difference in </w:t>
+      </w:r>
+      <w:proofErr w:type="spellStart"/>
+      <w:r>
+        <w:t>tenure_days</w:t>
+      </w:r>
+      <w:proofErr w:type="spellEnd"/>
+      <w:r>
+        <w:t xml:space="preserve"> between churned and non-churned customers.</w:t>
+      </w:r>
+    </w:p>
+    <w:p>
+      <w:pPr>
+        <w:rPr>
+          <w:lang w:val="en-US"/>
+        </w:rPr>
+      </w:pPr>
+      <w:r>
+        <w:rPr>
+          <w:b/>
+          <w:bCs/>
+          <w:lang w:val="en-US"/>
+        </w:rPr>
+        <w:t>H6: Price change ratio impacts churn</w:t>
+      </w:r>
+    </w:p>
+    <w:p>
+      <w:r>
+        <w:t>Confirmed</w:t>
+      </w:r>
+    </w:p>
+    <w:p>
+      <w:r>
+        <w:t xml:space="preserve">There is a significant difference in </w:t>
+      </w:r>
+      <w:proofErr w:type="spellStart"/>
+      <w:r>
+        <w:t>price_change_ratio</w:t>
+      </w:r>
+      <w:proofErr w:type="spellEnd"/>
+      <w:r>
+        <w:t xml:space="preserve"> between churned and non-churned customers.</w:t>
+      </w:r>
+    </w:p>
+    <w:p>
+      <w:pPr>
+        <w:rPr>
+          <w:lang w:val="en-US"/>
+        </w:rPr>
+      </w:pPr>
+      <w:r>
+        <w:rPr>
+          <w:b/>
+          <w:bCs/>
+          <w:lang w:val="en-US"/>
+        </w:rPr>
+        <w:t>H7: Proximity of last call to renewal (</w:t>
+      </w:r>
+      <w:proofErr w:type="spellStart"/>
+      <w:r>
+        <w:rPr>
+          <w:b/>
+          <w:bCs/>
+          <w:lang w:val="en-US"/>
+        </w:rPr>
+        <w:t>days_last_call_to_renewal</w:t>
+      </w:r>
+      <w:proofErr w:type="spellEnd"/>
+      <w:r>
+        <w:rPr>
+          <w:b/>
+          <w:bCs/>
+          <w:lang w:val="en-US"/>
+        </w:rPr>
+        <w:t>) impacts churn</w:t>
+      </w:r>
+    </w:p>
+    <w:p>
+      <w:r>
+        <w:t>Confirmed</w:t>
+      </w:r>
+    </w:p>
+    <w:p>
+      <w:r>
+        <w:t xml:space="preserve">There is a significant difference in </w:t>
+      </w:r>
+      <w:proofErr w:type="spellStart"/>
+      <w:r>
+        <w:t>days_last_call_to_renewal</w:t>
+      </w:r>
+      <w:proofErr w:type="spellEnd"/>
+      <w:r>
+        <w:t xml:space="preserve"> between churned and non-churned customers.</w:t>
+      </w:r>
+    </w:p>
+    <w:p>
+      <w:pPr>
+        <w:rPr>
+          <w:lang w:val="en-US"/>
+        </w:rPr>
+      </w:pPr>
+      <w:r>
+        <w:rPr>
+          <w:b/>
+          <w:bCs/>
+          <w:lang w:val="en-US"/>
+        </w:rPr>
+        <w:t>H8: Call frequency per month (</w:t>
+      </w:r>
+      <w:proofErr w:type="spellStart"/>
+      <w:r>
+        <w:rPr>
+          <w:b/>
+          <w:bCs/>
+          <w:lang w:val="en-US"/>
+        </w:rPr>
+        <w:t>call_freq_per_month</w:t>
+      </w:r>
+      <w:proofErr w:type="spellEnd"/>
+      <w:r>
+        <w:rPr>
+          <w:b/>
+          <w:bCs/>
+          <w:lang w:val="en-US"/>
+        </w:rPr>
+        <w:t>) impacts churn</w:t>
+      </w:r>
+    </w:p>
+    <w:p>
+      <w:r>
+        <w:t>Confirmed</w:t>
+      </w:r>
+    </w:p>
+    <w:p>
+      <w:r>
+        <w:t xml:space="preserve">There is a significant difference in </w:t>
+      </w:r>
+      <w:proofErr w:type="spellStart"/>
+      <w:r>
+        <w:t>call_freq_per_month</w:t>
+      </w:r>
+      <w:proofErr w:type="spellEnd"/>
+      <w:r>
+        <w:t xml:space="preserve"> between churned and non-churned customers.</w:t>
+      </w:r>
+    </w:p>
+    <w:p>
+      <w:pPr>
+        <w:rPr>
           <w:b/>
           <w:bCs/>
         </w:rPr>
@@ -2103,6 +2290,7 @@
         </w:numPr>
       </w:pPr>
       <w:r>
+        <w:lastRenderedPageBreak/>
         <w:t>Price change shock</w:t>
       </w:r>
     </w:p>
@@ -2303,7 +2491,6 @@
     </w:p>
     <w:p>
       <w:r>
-        <w:lastRenderedPageBreak/>
         <w:t>Categorical fields were label</w:t>
       </w:r>
       <w:r>
@@ -2520,6 +2707,7 @@
         <w:rPr>
           <w:noProof/>
         </w:rPr>
+        <w:lastRenderedPageBreak/>
         <w:drawing>
           <wp:anchor distT="0" distB="0" distL="114300" distR="114300" simplePos="0" relativeHeight="251659264" behindDoc="1" locked="0" layoutInCell="1" allowOverlap="1" wp14:anchorId="13B666AA" wp14:editId="41F86DE3">
             <wp:simplePos x="0" y="0"/>
@@ -2662,6 +2850,7 @@
         <w:rPr>
           <w:noProof/>
         </w:rPr>
+        <w:lastRenderedPageBreak/>
         <w:drawing>
           <wp:inline distT="0" distB="0" distL="0" distR="0" wp14:anchorId="0E8F3462" wp14:editId="29020FC4">
             <wp:extent cx="4815840" cy="2522220"/>

</xml_diff>